<commit_message>
Se agregaron y completaron los siguientes retos que indica el archivo "Taller_guiado.pdf", para culminar asi el trabajo del 24 de agosto; JavaScript con React
</commit_message>
<xml_diff>
--- a/RETOS_JAVASCRIPT_PRESENTACION.docx
+++ b/RETOS_JAVASCRIPT_PRESENTACION.docx
@@ -121,6 +121,7 @@
           <w:rFonts w:ascii="Times New Roman" w:hAnsi="Times New Roman"/>
           <w:b/>
           <w:bCs/>
+          <w:noProof/>
           <w:sz w:val="28"/>
         </w:rPr>
         <w:drawing>
@@ -169,6 +170,149 @@
           <w:sz w:val="28"/>
         </w:rPr>
       </w:pPr>
+      <w:r>
+        <w:rPr>
+          <w:rFonts w:ascii="Times New Roman" w:hAnsi="Times New Roman"/>
+          <w:b/>
+          <w:bCs/>
+          <w:sz w:val="28"/>
+        </w:rPr>
+        <w:t>PASO 1: Verificar identidad de Git</w:t>
+      </w:r>
+      <w:r>
+        <w:rPr>
+          <w:rFonts w:ascii="Times New Roman" w:hAnsi="Times New Roman"/>
+          <w:b/>
+          <w:bCs/>
+          <w:sz w:val="28"/>
+        </w:rPr>
+        <w:br/>
+      </w:r>
+      <w:r>
+        <w:rPr>
+          <w:rFonts w:ascii="Times New Roman" w:hAnsi="Times New Roman"/>
+          <w:b/>
+          <w:bCs/>
+          <w:sz w:val="28"/>
+        </w:rPr>
+        <w:drawing>
+          <wp:inline distT="0" distB="0" distL="0" distR="0" wp14:anchorId="7FE72536" wp14:editId="618B84D9">
+            <wp:extent cx="4143953" cy="1362265"/>
+            <wp:effectExtent l="0" t="0" r="9525" b="9525"/>
+            <wp:docPr id="1903527162" name="Imagen 1"/>
+            <wp:cNvGraphicFramePr>
+              <a:graphicFrameLocks xmlns:a="http://schemas.openxmlformats.org/drawingml/2006/main" noChangeAspect="1"/>
+            </wp:cNvGraphicFramePr>
+            <a:graphic xmlns:a="http://schemas.openxmlformats.org/drawingml/2006/main">
+              <a:graphicData uri="http://schemas.openxmlformats.org/drawingml/2006/picture">
+                <pic:pic xmlns:pic="http://schemas.openxmlformats.org/drawingml/2006/picture">
+                  <pic:nvPicPr>
+                    <pic:cNvPr id="1903527162" name=""/>
+                    <pic:cNvPicPr/>
+                  </pic:nvPicPr>
+                  <pic:blipFill>
+                    <a:blip r:embed="rId5"/>
+                    <a:stretch>
+                      <a:fillRect/>
+                    </a:stretch>
+                  </pic:blipFill>
+                  <pic:spPr>
+                    <a:xfrm>
+                      <a:off x="0" y="0"/>
+                      <a:ext cx="4143953" cy="1362265"/>
+                    </a:xfrm>
+                    <a:prstGeom prst="rect">
+                      <a:avLst/>
+                    </a:prstGeom>
+                  </pic:spPr>
+                </pic:pic>
+              </a:graphicData>
+            </a:graphic>
+          </wp:inline>
+        </w:drawing>
+      </w:r>
+    </w:p>
+    <w:p>
+      <w:pPr>
+        <w:rPr>
+          <w:rFonts w:ascii="Times New Roman" w:hAnsi="Times New Roman"/>
+          <w:b/>
+          <w:bCs/>
+          <w:sz w:val="28"/>
+        </w:rPr>
+      </w:pPr>
+      <w:r>
+        <w:rPr>
+          <w:rFonts w:ascii="Times New Roman" w:hAnsi="Times New Roman"/>
+          <w:b/>
+          <w:bCs/>
+          <w:sz w:val="28"/>
+        </w:rPr>
+        <w:t>PASO 2: PROYECTO REACT CON VITE</w:t>
+      </w:r>
+    </w:p>
+    <w:p>
+      <w:pPr>
+        <w:rPr>
+          <w:rFonts w:ascii="Times New Roman" w:hAnsi="Times New Roman"/>
+          <w:b/>
+          <w:bCs/>
+          <w:sz w:val="28"/>
+        </w:rPr>
+      </w:pPr>
+      <w:r>
+        <w:rPr>
+          <w:rFonts w:ascii="Times New Roman" w:hAnsi="Times New Roman"/>
+          <w:b/>
+          <w:bCs/>
+          <w:sz w:val="28"/>
+        </w:rPr>
+        <w:drawing>
+          <wp:inline distT="0" distB="0" distL="0" distR="0" wp14:anchorId="0BF5A8C0" wp14:editId="59DEB799">
+            <wp:extent cx="1502410" cy="2192655"/>
+            <wp:effectExtent l="0" t="0" r="2540" b="0"/>
+            <wp:docPr id="1622091595" name="Imagen 1"/>
+            <wp:cNvGraphicFramePr>
+              <a:graphicFrameLocks xmlns:a="http://schemas.openxmlformats.org/drawingml/2006/main" noChangeAspect="1"/>
+            </wp:cNvGraphicFramePr>
+            <a:graphic xmlns:a="http://schemas.openxmlformats.org/drawingml/2006/main">
+              <a:graphicData uri="http://schemas.openxmlformats.org/drawingml/2006/picture">
+                <pic:pic xmlns:pic="http://schemas.openxmlformats.org/drawingml/2006/picture">
+                  <pic:nvPicPr>
+                    <pic:cNvPr id="1622091595" name=""/>
+                    <pic:cNvPicPr/>
+                  </pic:nvPicPr>
+                  <pic:blipFill>
+                    <a:blip r:embed="rId6"/>
+                    <a:stretch>
+                      <a:fillRect/>
+                    </a:stretch>
+                  </pic:blipFill>
+                  <pic:spPr>
+                    <a:xfrm>
+                      <a:off x="0" y="0"/>
+                      <a:ext cx="1519564" cy="2217690"/>
+                    </a:xfrm>
+                    <a:prstGeom prst="rect">
+                      <a:avLst/>
+                    </a:prstGeom>
+                  </pic:spPr>
+                </pic:pic>
+              </a:graphicData>
+            </a:graphic>
+          </wp:inline>
+        </w:drawing>
+      </w:r>
+    </w:p>
+    <w:p>
+      <w:pPr>
+        <w:rPr>
+          <w:rFonts w:ascii="Times New Roman" w:hAnsi="Times New Roman"/>
+          <w:b/>
+          <w:bCs/>
+          <w:sz w:val="28"/>
+        </w:rPr>
+      </w:pPr>
     </w:p>
     <w:p>
       <w:pPr>
@@ -191,32 +335,24 @@
           <w:rFonts w:ascii="Times New Roman" w:hAnsi="Times New Roman"/>
           <w:sz w:val="28"/>
         </w:rPr>
-        <w:t xml:space="preserve">Funciones, parámetros y </w:t>
-      </w:r>
-      <w:proofErr w:type="spellStart"/>
-      <w:r>
-        <w:rPr>
-          <w:rFonts w:ascii="Times New Roman" w:hAnsi="Times New Roman"/>
-          <w:sz w:val="28"/>
-        </w:rPr>
-        <w:t>return</w:t>
-      </w:r>
-      <w:proofErr w:type="spellEnd"/>
-    </w:p>
-    <w:p>
-      <w:pPr>
-        <w:rPr>
-          <w:rFonts w:ascii="Times New Roman" w:hAnsi="Times New Roman"/>
-          <w:b/>
-          <w:bCs/>
-          <w:sz w:val="28"/>
-        </w:rPr>
-      </w:pPr>
-      <w:r>
-        <w:rPr>
-          <w:rFonts w:ascii="Times New Roman" w:hAnsi="Times New Roman"/>
-          <w:b/>
-          <w:bCs/>
+        <w:t>Funciones, parámetros y return</w:t>
+      </w:r>
+    </w:p>
+    <w:p>
+      <w:pPr>
+        <w:rPr>
+          <w:rFonts w:ascii="Times New Roman" w:hAnsi="Times New Roman"/>
+          <w:b/>
+          <w:bCs/>
+          <w:sz w:val="28"/>
+        </w:rPr>
+      </w:pPr>
+      <w:r>
+        <w:rPr>
+          <w:rFonts w:ascii="Times New Roman" w:hAnsi="Times New Roman"/>
+          <w:b/>
+          <w:bCs/>
+          <w:noProof/>
           <w:sz w:val="28"/>
         </w:rPr>
         <w:drawing>
@@ -235,7 +371,7 @@
                     <pic:cNvPicPr/>
                   </pic:nvPicPr>
                   <pic:blipFill>
-                    <a:blip r:embed="rId5"/>
+                    <a:blip r:embed="rId7"/>
                     <a:stretch>
                       <a:fillRect/>
                     </a:stretch>
@@ -270,7 +406,142 @@
           <w:bCs/>
           <w:sz w:val="28"/>
         </w:rPr>
+        <w:t xml:space="preserve">TAREA: </w:t>
+      </w:r>
+      <w:r>
+        <w:rPr>
+          <w:rFonts w:ascii="Times New Roman" w:hAnsi="Times New Roman"/>
+          <w:sz w:val="28"/>
+        </w:rPr>
+        <w:t>Funciones sumar, restar, multiplicar, dividir y promedio. Además, explicación de la diferencia entre ‘Return’ y ‘console.log’</w:t>
+      </w:r>
+    </w:p>
+    <w:p>
+      <w:pPr>
+        <w:rPr>
+          <w:rFonts w:ascii="Times New Roman" w:hAnsi="Times New Roman"/>
+          <w:b/>
+          <w:bCs/>
+          <w:sz w:val="28"/>
+        </w:rPr>
+      </w:pPr>
+      <w:r>
+        <w:rPr>
+          <w:rFonts w:ascii="Times New Roman" w:hAnsi="Times New Roman"/>
+          <w:b/>
+          <w:bCs/>
+          <w:noProof/>
+          <w:sz w:val="28"/>
+        </w:rPr>
+        <w:drawing>
+          <wp:inline distT="0" distB="0" distL="0" distR="0" wp14:anchorId="0B39F722" wp14:editId="0B855DD5">
+            <wp:extent cx="3403158" cy="3515869"/>
+            <wp:effectExtent l="0" t="0" r="6985" b="8890"/>
+            <wp:docPr id="251118738" name="Imagen 1"/>
+            <wp:cNvGraphicFramePr>
+              <a:graphicFrameLocks xmlns:a="http://schemas.openxmlformats.org/drawingml/2006/main" noChangeAspect="1"/>
+            </wp:cNvGraphicFramePr>
+            <a:graphic xmlns:a="http://schemas.openxmlformats.org/drawingml/2006/main">
+              <a:graphicData uri="http://schemas.openxmlformats.org/drawingml/2006/picture">
+                <pic:pic xmlns:pic="http://schemas.openxmlformats.org/drawingml/2006/picture">
+                  <pic:nvPicPr>
+                    <pic:cNvPr id="251118738" name=""/>
+                    <pic:cNvPicPr/>
+                  </pic:nvPicPr>
+                  <pic:blipFill>
+                    <a:blip r:embed="rId8"/>
+                    <a:stretch>
+                      <a:fillRect/>
+                    </a:stretch>
+                  </pic:blipFill>
+                  <pic:spPr>
+                    <a:xfrm>
+                      <a:off x="0" y="0"/>
+                      <a:ext cx="3420993" cy="3534295"/>
+                    </a:xfrm>
+                    <a:prstGeom prst="rect">
+                      <a:avLst/>
+                    </a:prstGeom>
+                  </pic:spPr>
+                </pic:pic>
+              </a:graphicData>
+            </a:graphic>
+          </wp:inline>
+        </w:drawing>
+      </w:r>
+    </w:p>
+    <w:p>
+      <w:pPr>
+        <w:rPr>
+          <w:noProof/>
+        </w:rPr>
+      </w:pPr>
+      <w:r>
+        <w:rPr>
+          <w:noProof/>
+        </w:rPr>
         <w:lastRenderedPageBreak/>
+        <w:t xml:space="preserve"> </w:t>
+      </w:r>
+      <w:r>
+        <w:rPr>
+          <w:rFonts w:ascii="Times New Roman" w:hAnsi="Times New Roman"/>
+          <w:b/>
+          <w:bCs/>
+          <w:noProof/>
+          <w:sz w:val="28"/>
+        </w:rPr>
+        <w:drawing>
+          <wp:inline distT="0" distB="0" distL="0" distR="0" wp14:anchorId="792D69FD" wp14:editId="03EADE4D">
+            <wp:extent cx="3696790" cy="3912042"/>
+            <wp:effectExtent l="0" t="0" r="0" b="0"/>
+            <wp:docPr id="778096743" name="Imagen 1"/>
+            <wp:cNvGraphicFramePr>
+              <a:graphicFrameLocks xmlns:a="http://schemas.openxmlformats.org/drawingml/2006/main" noChangeAspect="1"/>
+            </wp:cNvGraphicFramePr>
+            <a:graphic xmlns:a="http://schemas.openxmlformats.org/drawingml/2006/main">
+              <a:graphicData uri="http://schemas.openxmlformats.org/drawingml/2006/picture">
+                <pic:pic xmlns:pic="http://schemas.openxmlformats.org/drawingml/2006/picture">
+                  <pic:nvPicPr>
+                    <pic:cNvPr id="778096743" name=""/>
+                    <pic:cNvPicPr/>
+                  </pic:nvPicPr>
+                  <pic:blipFill>
+                    <a:blip r:embed="rId9"/>
+                    <a:stretch>
+                      <a:fillRect/>
+                    </a:stretch>
+                  </pic:blipFill>
+                  <pic:spPr>
+                    <a:xfrm>
+                      <a:off x="0" y="0"/>
+                      <a:ext cx="3727288" cy="3944316"/>
+                    </a:xfrm>
+                    <a:prstGeom prst="rect">
+                      <a:avLst/>
+                    </a:prstGeom>
+                  </pic:spPr>
+                </pic:pic>
+              </a:graphicData>
+            </a:graphic>
+          </wp:inline>
+        </w:drawing>
+      </w:r>
+    </w:p>
+    <w:p>
+      <w:pPr>
+        <w:rPr>
+          <w:rFonts w:ascii="Times New Roman" w:hAnsi="Times New Roman"/>
+          <w:sz w:val="28"/>
+        </w:rPr>
+      </w:pPr>
+      <w:r>
+        <w:rPr>
+          <w:rFonts w:ascii="Times New Roman" w:hAnsi="Times New Roman"/>
+          <w:b/>
+          <w:bCs/>
+          <w:sz w:val="28"/>
+        </w:rPr>
         <w:t xml:space="preserve">JAVASCRIPT 2: </w:t>
       </w:r>
       <w:r>
@@ -290,6 +561,7 @@
       <w:r>
         <w:rPr>
           <w:rFonts w:ascii="Times New Roman" w:hAnsi="Times New Roman"/>
+          <w:noProof/>
           <w:sz w:val="28"/>
         </w:rPr>
         <w:drawing>
@@ -308,7 +580,7 @@
                     <pic:cNvPicPr/>
                   </pic:nvPicPr>
                   <pic:blipFill>
-                    <a:blip r:embed="rId6"/>
+                    <a:blip r:embed="rId10"/>
                     <a:stretch>
                       <a:fillRect/>
                     </a:stretch>
@@ -333,24 +605,173 @@
       <w:pPr>
         <w:rPr>
           <w:rFonts w:ascii="Times New Roman" w:hAnsi="Times New Roman"/>
-          <w:sz w:val="28"/>
-        </w:rPr>
-      </w:pPr>
-    </w:p>
-    <w:p>
-      <w:pPr>
-        <w:rPr>
-          <w:rFonts w:ascii="Times New Roman" w:hAnsi="Times New Roman"/>
-          <w:sz w:val="28"/>
-        </w:rPr>
-      </w:pPr>
-      <w:r>
-        <w:rPr>
-          <w:rFonts w:ascii="Times New Roman" w:hAnsi="Times New Roman"/>
-          <w:b/>
-          <w:bCs/>
-          <w:sz w:val="28"/>
-        </w:rPr>
+          <w:b/>
+          <w:bCs/>
+          <w:sz w:val="28"/>
+        </w:rPr>
+      </w:pPr>
+      <w:r>
+        <w:rPr>
+          <w:rFonts w:ascii="Times New Roman" w:hAnsi="Times New Roman"/>
+          <w:b/>
+          <w:bCs/>
+          <w:sz w:val="28"/>
+        </w:rPr>
+        <w:br w:type="page"/>
+      </w:r>
+    </w:p>
+    <w:p>
+      <w:pPr>
+        <w:rPr>
+          <w:rFonts w:ascii="Times New Roman" w:hAnsi="Times New Roman"/>
+          <w:sz w:val="28"/>
+        </w:rPr>
+      </w:pPr>
+      <w:r>
+        <w:rPr>
+          <w:rFonts w:ascii="Times New Roman" w:hAnsi="Times New Roman"/>
+          <w:b/>
+          <w:bCs/>
+          <w:sz w:val="28"/>
+        </w:rPr>
+        <w:lastRenderedPageBreak/>
+        <w:t xml:space="preserve">TAREA: </w:t>
+      </w:r>
+      <w:r>
+        <w:rPr>
+          <w:rFonts w:ascii="Times New Roman" w:hAnsi="Times New Roman"/>
+          <w:sz w:val="28"/>
+        </w:rPr>
+        <w:t>Las funciones: cuadrado, esMayorEdad, nombreCompleto convertirlas a función tipo flecha.</w:t>
+      </w:r>
+      <w:r>
+        <w:rPr>
+          <w:rFonts w:ascii="Times New Roman" w:hAnsi="Times New Roman"/>
+          <w:sz w:val="28"/>
+        </w:rPr>
+        <w:br/>
+      </w:r>
+      <w:r>
+        <w:rPr>
+          <w:rFonts w:ascii="Times New Roman" w:hAnsi="Times New Roman"/>
+          <w:sz w:val="28"/>
+        </w:rPr>
+        <w:drawing>
+          <wp:inline distT="0" distB="0" distL="0" distR="0" wp14:anchorId="322DA6D4" wp14:editId="1C65DD46">
+            <wp:extent cx="4925112" cy="3238952"/>
+            <wp:effectExtent l="0" t="0" r="8890" b="0"/>
+            <wp:docPr id="1523793546" name="Imagen 1"/>
+            <wp:cNvGraphicFramePr>
+              <a:graphicFrameLocks xmlns:a="http://schemas.openxmlformats.org/drawingml/2006/main" noChangeAspect="1"/>
+            </wp:cNvGraphicFramePr>
+            <a:graphic xmlns:a="http://schemas.openxmlformats.org/drawingml/2006/main">
+              <a:graphicData uri="http://schemas.openxmlformats.org/drawingml/2006/picture">
+                <pic:pic xmlns:pic="http://schemas.openxmlformats.org/drawingml/2006/picture">
+                  <pic:nvPicPr>
+                    <pic:cNvPr id="1523793546" name=""/>
+                    <pic:cNvPicPr/>
+                  </pic:nvPicPr>
+                  <pic:blipFill>
+                    <a:blip r:embed="rId11"/>
+                    <a:stretch>
+                      <a:fillRect/>
+                    </a:stretch>
+                  </pic:blipFill>
+                  <pic:spPr>
+                    <a:xfrm>
+                      <a:off x="0" y="0"/>
+                      <a:ext cx="4925112" cy="3238952"/>
+                    </a:xfrm>
+                    <a:prstGeom prst="rect">
+                      <a:avLst/>
+                    </a:prstGeom>
+                  </pic:spPr>
+                </pic:pic>
+              </a:graphicData>
+            </a:graphic>
+          </wp:inline>
+        </w:drawing>
+      </w:r>
+    </w:p>
+    <w:p>
+      <w:pPr>
+        <w:rPr>
+          <w:rFonts w:ascii="Times New Roman" w:hAnsi="Times New Roman"/>
+          <w:sz w:val="28"/>
+        </w:rPr>
+      </w:pPr>
+      <w:r>
+        <w:rPr>
+          <w:rFonts w:ascii="Times New Roman" w:hAnsi="Times New Roman"/>
+          <w:sz w:val="28"/>
+        </w:rPr>
+        <w:drawing>
+          <wp:inline distT="0" distB="0" distL="0" distR="0" wp14:anchorId="3592DC98" wp14:editId="4FC68FCF">
+            <wp:extent cx="5208104" cy="3554467"/>
+            <wp:effectExtent l="0" t="0" r="0" b="8255"/>
+            <wp:docPr id="36154713" name="Imagen 1"/>
+            <wp:cNvGraphicFramePr>
+              <a:graphicFrameLocks xmlns:a="http://schemas.openxmlformats.org/drawingml/2006/main" noChangeAspect="1"/>
+            </wp:cNvGraphicFramePr>
+            <a:graphic xmlns:a="http://schemas.openxmlformats.org/drawingml/2006/main">
+              <a:graphicData uri="http://schemas.openxmlformats.org/drawingml/2006/picture">
+                <pic:pic xmlns:pic="http://schemas.openxmlformats.org/drawingml/2006/picture">
+                  <pic:nvPicPr>
+                    <pic:cNvPr id="36154713" name=""/>
+                    <pic:cNvPicPr/>
+                  </pic:nvPicPr>
+                  <pic:blipFill>
+                    <a:blip r:embed="rId12"/>
+                    <a:stretch>
+                      <a:fillRect/>
+                    </a:stretch>
+                  </pic:blipFill>
+                  <pic:spPr>
+                    <a:xfrm>
+                      <a:off x="0" y="0"/>
+                      <a:ext cx="5211203" cy="3556582"/>
+                    </a:xfrm>
+                    <a:prstGeom prst="rect">
+                      <a:avLst/>
+                    </a:prstGeom>
+                  </pic:spPr>
+                </pic:pic>
+              </a:graphicData>
+            </a:graphic>
+          </wp:inline>
+        </w:drawing>
+      </w:r>
+    </w:p>
+    <w:p>
+      <w:pPr>
+        <w:rPr>
+          <w:rFonts w:ascii="Times New Roman" w:hAnsi="Times New Roman"/>
+          <w:sz w:val="28"/>
+        </w:rPr>
+      </w:pPr>
+      <w:r>
+        <w:rPr>
+          <w:rFonts w:ascii="Times New Roman" w:hAnsi="Times New Roman"/>
+          <w:sz w:val="28"/>
+        </w:rPr>
+        <w:br w:type="page"/>
+      </w:r>
+    </w:p>
+    <w:p>
+      <w:pPr>
+        <w:rPr>
+          <w:rFonts w:ascii="Times New Roman" w:hAnsi="Times New Roman"/>
+          <w:sz w:val="28"/>
+        </w:rPr>
+      </w:pPr>
+      <w:r>
+        <w:rPr>
+          <w:rFonts w:ascii="Times New Roman" w:hAnsi="Times New Roman"/>
+          <w:b/>
+          <w:bCs/>
+          <w:sz w:val="28"/>
+        </w:rPr>
+        <w:lastRenderedPageBreak/>
         <w:t xml:space="preserve">JAVASCRIPT 3: </w:t>
       </w:r>
       <w:r>
@@ -358,23 +779,7 @@
           <w:rFonts w:ascii="Times New Roman" w:hAnsi="Times New Roman"/>
           <w:sz w:val="28"/>
         </w:rPr>
-        <w:t xml:space="preserve">Arreglos de objetos; agregar 7 objetos </w:t>
-      </w:r>
-      <w:proofErr w:type="spellStart"/>
-      <w:r>
-        <w:rPr>
-          <w:rFonts w:ascii="Times New Roman" w:hAnsi="Times New Roman"/>
-          <w:sz w:val="28"/>
-        </w:rPr>
-        <w:t>mas</w:t>
-      </w:r>
-      <w:proofErr w:type="spellEnd"/>
-      <w:r>
-        <w:rPr>
-          <w:rFonts w:ascii="Times New Roman" w:hAnsi="Times New Roman"/>
-          <w:sz w:val="28"/>
-        </w:rPr>
-        <w:t xml:space="preserve"> sin repetir id:</w:t>
+        <w:t>Arreglos de objetos; agregar 7 objetos mas sin repetir id:</w:t>
       </w:r>
       <w:r>
         <w:rPr>
@@ -386,12 +791,13 @@
       <w:r>
         <w:rPr>
           <w:rFonts w:ascii="Times New Roman" w:hAnsi="Times New Roman"/>
+          <w:noProof/>
           <w:sz w:val="28"/>
         </w:rPr>
         <w:drawing>
-          <wp:inline distT="0" distB="0" distL="0" distR="0" wp14:anchorId="4D2AD953" wp14:editId="4D9AE1A0">
-            <wp:extent cx="4253948" cy="4318938"/>
-            <wp:effectExtent l="0" t="0" r="0" b="5715"/>
+          <wp:inline distT="0" distB="0" distL="0" distR="0" wp14:anchorId="4D2AD953" wp14:editId="18860B0E">
+            <wp:extent cx="3546282" cy="3600460"/>
+            <wp:effectExtent l="0" t="0" r="0" b="0"/>
             <wp:docPr id="1128492007" name="Imagen 1"/>
             <wp:cNvGraphicFramePr>
               <a:graphicFrameLocks xmlns:a="http://schemas.openxmlformats.org/drawingml/2006/main" noChangeAspect="1"/>
@@ -404,7 +810,7 @@
                     <pic:cNvPicPr/>
                   </pic:nvPicPr>
                   <pic:blipFill>
-                    <a:blip r:embed="rId7"/>
+                    <a:blip r:embed="rId13"/>
                     <a:stretch>
                       <a:fillRect/>
                     </a:stretch>
@@ -412,7 +818,7 @@
                   <pic:spPr>
                     <a:xfrm>
                       <a:off x="0" y="0"/>
-                      <a:ext cx="4282318" cy="4347741"/>
+                      <a:ext cx="3574947" cy="3629562"/>
                     </a:xfrm>
                     <a:prstGeom prst="rect">
                       <a:avLst/>
@@ -441,89 +847,21 @@
         </w:rPr>
         <w:t xml:space="preserve">JAVASCRIPT 4: </w:t>
       </w:r>
-      <w:proofErr w:type="spellStart"/>
-      <w:proofErr w:type="gramStart"/>
-      <w:r>
-        <w:rPr>
-          <w:rFonts w:ascii="Times New Roman" w:hAnsi="Times New Roman"/>
-          <w:sz w:val="28"/>
-        </w:rPr>
-        <w:t>ForEach</w:t>
-      </w:r>
-      <w:proofErr w:type="spellEnd"/>
-      <w:r>
-        <w:rPr>
-          <w:rFonts w:ascii="Times New Roman" w:hAnsi="Times New Roman"/>
-          <w:sz w:val="28"/>
-        </w:rPr>
-        <w:t>(</w:t>
-      </w:r>
-      <w:proofErr w:type="gramEnd"/>
-      <w:r>
-        <w:rPr>
-          <w:rFonts w:ascii="Times New Roman" w:hAnsi="Times New Roman"/>
-          <w:sz w:val="28"/>
-        </w:rPr>
-        <w:t xml:space="preserve">) vs </w:t>
-      </w:r>
-      <w:proofErr w:type="spellStart"/>
-      <w:proofErr w:type="gramStart"/>
-      <w:r>
-        <w:rPr>
-          <w:rFonts w:ascii="Times New Roman" w:hAnsi="Times New Roman"/>
-          <w:sz w:val="28"/>
-        </w:rPr>
-        <w:t>map</w:t>
-      </w:r>
-      <w:proofErr w:type="spellEnd"/>
-      <w:r>
-        <w:rPr>
-          <w:rFonts w:ascii="Times New Roman" w:hAnsi="Times New Roman"/>
-          <w:sz w:val="28"/>
-        </w:rPr>
-        <w:t>(</w:t>
-      </w:r>
-      <w:proofErr w:type="gramEnd"/>
-      <w:r>
-        <w:rPr>
-          <w:rFonts w:ascii="Times New Roman" w:hAnsi="Times New Roman"/>
-          <w:sz w:val="28"/>
-        </w:rPr>
-        <w:t>)</w:t>
-      </w:r>
-    </w:p>
-    <w:p>
-      <w:pPr>
-        <w:rPr>
-          <w:rFonts w:ascii="Times New Roman" w:hAnsi="Times New Roman"/>
-          <w:sz w:val="28"/>
-        </w:rPr>
-      </w:pPr>
-      <w:proofErr w:type="spellStart"/>
-      <w:proofErr w:type="gramStart"/>
-      <w:r>
-        <w:rPr>
-          <w:rFonts w:ascii="Times New Roman" w:hAnsi="Times New Roman"/>
-          <w:sz w:val="28"/>
-        </w:rPr>
-        <w:t>forEach</w:t>
-      </w:r>
-      <w:proofErr w:type="spellEnd"/>
-      <w:r>
-        <w:rPr>
-          <w:rFonts w:ascii="Times New Roman" w:hAnsi="Times New Roman"/>
-          <w:sz w:val="28"/>
-        </w:rPr>
-        <w:t>(</w:t>
-      </w:r>
-      <w:proofErr w:type="gramEnd"/>
-      <w:r>
-        <w:rPr>
-          <w:rFonts w:ascii="Times New Roman" w:hAnsi="Times New Roman"/>
-          <w:sz w:val="28"/>
-        </w:rPr>
-        <w:t>):</w:t>
-      </w:r>
+      <w:r>
+        <w:rPr>
+          <w:rFonts w:ascii="Times New Roman" w:hAnsi="Times New Roman"/>
+          <w:sz w:val="28"/>
+        </w:rPr>
+        <w:t>ForEach() vs map()</w:t>
+      </w:r>
+    </w:p>
+    <w:p>
+      <w:pPr>
+        <w:rPr>
+          <w:rFonts w:ascii="Times New Roman" w:hAnsi="Times New Roman"/>
+          <w:sz w:val="28"/>
+        </w:rPr>
+      </w:pPr>
       <w:r>
         <w:rPr>
           <w:rFonts w:ascii="Times New Roman" w:hAnsi="Times New Roman"/>
@@ -534,12 +872,13 @@
       <w:r>
         <w:rPr>
           <w:rFonts w:ascii="Times New Roman" w:hAnsi="Times New Roman"/>
+          <w:noProof/>
           <w:sz w:val="28"/>
         </w:rPr>
         <w:drawing>
-          <wp:inline distT="0" distB="0" distL="0" distR="0" wp14:anchorId="06C5DCFC" wp14:editId="2AC2CD88">
-            <wp:extent cx="3625668" cy="3530379"/>
-            <wp:effectExtent l="0" t="0" r="0" b="0"/>
+          <wp:inline distT="0" distB="0" distL="0" distR="0" wp14:anchorId="06C5DCFC" wp14:editId="755FCD4C">
+            <wp:extent cx="3617843" cy="3522760"/>
+            <wp:effectExtent l="0" t="0" r="1905" b="1905"/>
             <wp:docPr id="521576382" name="Imagen 1"/>
             <wp:cNvGraphicFramePr>
               <a:graphicFrameLocks xmlns:a="http://schemas.openxmlformats.org/drawingml/2006/main" noChangeAspect="1"/>
@@ -552,7 +891,7 @@
                     <pic:cNvPicPr/>
                   </pic:nvPicPr>
                   <pic:blipFill>
-                    <a:blip r:embed="rId8"/>
+                    <a:blip r:embed="rId14"/>
                     <a:stretch>
                       <a:fillRect/>
                     </a:stretch>
@@ -560,7 +899,7 @@
                   <pic:spPr>
                     <a:xfrm>
                       <a:off x="0" y="0"/>
-                      <a:ext cx="3638214" cy="3542595"/>
+                      <a:ext cx="3636310" cy="3540742"/>
                     </a:xfrm>
                     <a:prstGeom prst="rect">
                       <a:avLst/>
@@ -582,53 +921,33 @@
           <w:sz w:val="28"/>
         </w:rPr>
       </w:pPr>
-      <w:proofErr w:type="spellStart"/>
-      <w:proofErr w:type="gramStart"/>
-      <w:r>
-        <w:rPr>
-          <w:rFonts w:ascii="Times New Roman" w:hAnsi="Times New Roman"/>
-          <w:b/>
-          <w:bCs/>
-          <w:sz w:val="28"/>
-        </w:rPr>
-        <w:t>map</w:t>
-      </w:r>
-      <w:proofErr w:type="spellEnd"/>
-      <w:r>
-        <w:rPr>
-          <w:rFonts w:ascii="Times New Roman" w:hAnsi="Times New Roman"/>
-          <w:b/>
-          <w:bCs/>
-          <w:sz w:val="28"/>
-        </w:rPr>
-        <w:t>(</w:t>
-      </w:r>
-      <w:proofErr w:type="gramEnd"/>
-      <w:r>
-        <w:rPr>
-          <w:rFonts w:ascii="Times New Roman" w:hAnsi="Times New Roman"/>
-          <w:b/>
-          <w:bCs/>
-          <w:sz w:val="28"/>
-        </w:rPr>
-        <w:t>)</w:t>
-      </w:r>
-    </w:p>
-    <w:p>
-      <w:pPr>
-        <w:rPr>
-          <w:rFonts w:ascii="Times New Roman" w:hAnsi="Times New Roman"/>
-          <w:sz w:val="28"/>
-        </w:rPr>
-      </w:pPr>
-      <w:r>
-        <w:rPr>
-          <w:rFonts w:ascii="Times New Roman" w:hAnsi="Times New Roman"/>
+      <w:r>
+        <w:rPr>
+          <w:rFonts w:ascii="Times New Roman" w:hAnsi="Times New Roman"/>
+          <w:b/>
+          <w:bCs/>
+          <w:sz w:val="28"/>
+        </w:rPr>
+        <w:lastRenderedPageBreak/>
+        <w:t>map()</w:t>
+      </w:r>
+    </w:p>
+    <w:p>
+      <w:pPr>
+        <w:rPr>
+          <w:rFonts w:ascii="Times New Roman" w:hAnsi="Times New Roman"/>
+          <w:sz w:val="28"/>
+        </w:rPr>
+      </w:pPr>
+      <w:r>
+        <w:rPr>
+          <w:rFonts w:ascii="Times New Roman" w:hAnsi="Times New Roman"/>
+          <w:noProof/>
           <w:sz w:val="28"/>
         </w:rPr>
         <w:drawing>
-          <wp:inline distT="0" distB="0" distL="0" distR="0" wp14:anchorId="60E4D903" wp14:editId="541C5FDC">
-            <wp:extent cx="3624659" cy="3641698"/>
+          <wp:inline distT="0" distB="0" distL="0" distR="0" wp14:anchorId="60E4D903" wp14:editId="443CEFA8">
+            <wp:extent cx="3856383" cy="3874511"/>
             <wp:effectExtent l="0" t="0" r="0" b="0"/>
             <wp:docPr id="845896140" name="Imagen 1"/>
             <wp:cNvGraphicFramePr>
@@ -642,7 +961,7 @@
                     <pic:cNvPicPr/>
                   </pic:nvPicPr>
                   <pic:blipFill>
-                    <a:blip r:embed="rId9"/>
+                    <a:blip r:embed="rId15"/>
                     <a:stretch>
                       <a:fillRect/>
                     </a:stretch>
@@ -650,7 +969,7 @@
                   <pic:spPr>
                     <a:xfrm>
                       <a:off x="0" y="0"/>
-                      <a:ext cx="3655305" cy="3672488"/>
+                      <a:ext cx="3905463" cy="3923822"/>
                     </a:xfrm>
                     <a:prstGeom prst="rect">
                       <a:avLst/>
@@ -673,52 +992,121 @@
       <w:r>
         <w:rPr>
           <w:rFonts w:ascii="Times New Roman" w:hAnsi="Times New Roman"/>
+          <w:sz w:val="28"/>
+        </w:rPr>
+        <w:drawing>
+          <wp:inline distT="0" distB="0" distL="0" distR="0" wp14:anchorId="528D1B77" wp14:editId="3838E303">
+            <wp:extent cx="3943847" cy="3701570"/>
+            <wp:effectExtent l="0" t="0" r="0" b="0"/>
+            <wp:docPr id="802112505" name="Imagen 1"/>
+            <wp:cNvGraphicFramePr>
+              <a:graphicFrameLocks xmlns:a="http://schemas.openxmlformats.org/drawingml/2006/main" noChangeAspect="1"/>
+            </wp:cNvGraphicFramePr>
+            <a:graphic xmlns:a="http://schemas.openxmlformats.org/drawingml/2006/main">
+              <a:graphicData uri="http://schemas.openxmlformats.org/drawingml/2006/picture">
+                <pic:pic xmlns:pic="http://schemas.openxmlformats.org/drawingml/2006/picture">
+                  <pic:nvPicPr>
+                    <pic:cNvPr id="802112505" name=""/>
+                    <pic:cNvPicPr/>
+                  </pic:nvPicPr>
+                  <pic:blipFill>
+                    <a:blip r:embed="rId16"/>
+                    <a:stretch>
+                      <a:fillRect/>
+                    </a:stretch>
+                  </pic:blipFill>
+                  <pic:spPr>
+                    <a:xfrm>
+                      <a:off x="0" y="0"/>
+                      <a:ext cx="3954887" cy="3711932"/>
+                    </a:xfrm>
+                    <a:prstGeom prst="rect">
+                      <a:avLst/>
+                    </a:prstGeom>
+                  </pic:spPr>
+                </pic:pic>
+              </a:graphicData>
+            </a:graphic>
+          </wp:inline>
+        </w:drawing>
+      </w:r>
+    </w:p>
+    <w:p>
+      <w:pPr>
+        <w:rPr>
+          <w:rFonts w:ascii="Times New Roman" w:hAnsi="Times New Roman"/>
+          <w:sz w:val="28"/>
+        </w:rPr>
+      </w:pPr>
+      <w:r>
+        <w:rPr>
+          <w:rFonts w:ascii="Times New Roman" w:hAnsi="Times New Roman"/>
+          <w:sz w:val="28"/>
+        </w:rPr>
+        <w:lastRenderedPageBreak/>
+        <w:drawing>
+          <wp:inline distT="0" distB="0" distL="0" distR="0" wp14:anchorId="3487DF73" wp14:editId="618AB8AF">
+            <wp:extent cx="3586038" cy="4407072"/>
+            <wp:effectExtent l="0" t="0" r="0" b="0"/>
+            <wp:docPr id="128680925" name="Imagen 1"/>
+            <wp:cNvGraphicFramePr>
+              <a:graphicFrameLocks xmlns:a="http://schemas.openxmlformats.org/drawingml/2006/main" noChangeAspect="1"/>
+            </wp:cNvGraphicFramePr>
+            <a:graphic xmlns:a="http://schemas.openxmlformats.org/drawingml/2006/main">
+              <a:graphicData uri="http://schemas.openxmlformats.org/drawingml/2006/picture">
+                <pic:pic xmlns:pic="http://schemas.openxmlformats.org/drawingml/2006/picture">
+                  <pic:nvPicPr>
+                    <pic:cNvPr id="128680925" name=""/>
+                    <pic:cNvPicPr/>
+                  </pic:nvPicPr>
+                  <pic:blipFill>
+                    <a:blip r:embed="rId17"/>
+                    <a:stretch>
+                      <a:fillRect/>
+                    </a:stretch>
+                  </pic:blipFill>
+                  <pic:spPr>
+                    <a:xfrm>
+                      <a:off x="0" y="0"/>
+                      <a:ext cx="3601128" cy="4425617"/>
+                    </a:xfrm>
+                    <a:prstGeom prst="rect">
+                      <a:avLst/>
+                    </a:prstGeom>
+                  </pic:spPr>
+                </pic:pic>
+              </a:graphicData>
+            </a:graphic>
+          </wp:inline>
+        </w:drawing>
+      </w:r>
+    </w:p>
+    <w:p>
+      <w:pPr>
+        <w:rPr>
+          <w:rFonts w:ascii="Times New Roman" w:hAnsi="Times New Roman"/>
+          <w:b/>
+          <w:bCs/>
+          <w:sz w:val="28"/>
+        </w:rPr>
+      </w:pPr>
+      <w:r>
+        <w:rPr>
+          <w:rFonts w:ascii="Times New Roman" w:hAnsi="Times New Roman"/>
           <w:b/>
           <w:bCs/>
           <w:sz w:val="28"/>
         </w:rPr>
         <w:t xml:space="preserve">JAVASCRIPT 5: </w:t>
       </w:r>
-      <w:proofErr w:type="spellStart"/>
-      <w:proofErr w:type="gramStart"/>
-      <w:r>
-        <w:rPr>
-          <w:rFonts w:ascii="Times New Roman" w:hAnsi="Times New Roman"/>
-          <w:sz w:val="28"/>
-        </w:rPr>
-        <w:t>filter</w:t>
-      </w:r>
-      <w:proofErr w:type="spellEnd"/>
-      <w:r>
-        <w:rPr>
-          <w:rFonts w:ascii="Times New Roman" w:hAnsi="Times New Roman"/>
-          <w:sz w:val="28"/>
-        </w:rPr>
-        <w:t>(</w:t>
-      </w:r>
-      <w:proofErr w:type="gramEnd"/>
-      <w:r>
-        <w:rPr>
-          <w:rFonts w:ascii="Times New Roman" w:hAnsi="Times New Roman"/>
-          <w:sz w:val="28"/>
-        </w:rPr>
-        <w:t xml:space="preserve">) y </w:t>
-      </w:r>
-      <w:proofErr w:type="spellStart"/>
-      <w:r>
-        <w:rPr>
-          <w:rFonts w:ascii="Times New Roman" w:hAnsi="Times New Roman"/>
-          <w:sz w:val="28"/>
-        </w:rPr>
-        <w:t>find</w:t>
-      </w:r>
-      <w:proofErr w:type="spellEnd"/>
-      <w:r>
-        <w:rPr>
-          <w:rFonts w:ascii="Times New Roman" w:hAnsi="Times New Roman"/>
-          <w:sz w:val="28"/>
-        </w:rPr>
-        <w:t>()</w:t>
+      <w:r>
+        <w:rPr>
+          <w:rFonts w:ascii="Times New Roman" w:hAnsi="Times New Roman"/>
+          <w:b/>
+          <w:bCs/>
+          <w:sz w:val="28"/>
+        </w:rPr>
+        <w:t>filter() y find()</w:t>
       </w:r>
       <w:r>
         <w:rPr>
@@ -727,8 +1115,6 @@
         </w:rPr>
         <w:br/>
       </w:r>
-      <w:proofErr w:type="spellStart"/>
-      <w:proofErr w:type="gramStart"/>
       <w:r>
         <w:rPr>
           <w:rFonts w:ascii="Times New Roman" w:hAnsi="Times New Roman"/>
@@ -737,37 +1123,516 @@
           <w:sz w:val="32"/>
           <w:szCs w:val="28"/>
         </w:rPr>
-        <w:t>filter</w:t>
-      </w:r>
-      <w:proofErr w:type="spellEnd"/>
-      <w:r>
-        <w:rPr>
-          <w:rFonts w:ascii="Times New Roman" w:hAnsi="Times New Roman"/>
-          <w:b/>
-          <w:bCs/>
-          <w:sz w:val="32"/>
-          <w:szCs w:val="28"/>
-        </w:rPr>
-        <w:t>(</w:t>
-      </w:r>
-      <w:proofErr w:type="gramEnd"/>
-      <w:r>
-        <w:rPr>
-          <w:rFonts w:ascii="Times New Roman" w:hAnsi="Times New Roman"/>
-          <w:b/>
-          <w:bCs/>
-          <w:sz w:val="32"/>
-          <w:szCs w:val="28"/>
-        </w:rPr>
-        <w:t>):</w:t>
-      </w:r>
-      <w:r>
-        <w:rPr>
-          <w:rFonts w:ascii="Times New Roman" w:hAnsi="Times New Roman"/>
-          <w:sz w:val="28"/>
-        </w:rPr>
+        <w:drawing>
+          <wp:inline distT="0" distB="0" distL="0" distR="0" wp14:anchorId="1F0DA492" wp14:editId="4A5FFCE9">
+            <wp:extent cx="4259440" cy="3395207"/>
+            <wp:effectExtent l="0" t="0" r="8255" b="0"/>
+            <wp:docPr id="1295488584" name="Imagen 1"/>
+            <wp:cNvGraphicFramePr>
+              <a:graphicFrameLocks xmlns:a="http://schemas.openxmlformats.org/drawingml/2006/main" noChangeAspect="1"/>
+            </wp:cNvGraphicFramePr>
+            <a:graphic xmlns:a="http://schemas.openxmlformats.org/drawingml/2006/main">
+              <a:graphicData uri="http://schemas.openxmlformats.org/drawingml/2006/picture">
+                <pic:pic xmlns:pic="http://schemas.openxmlformats.org/drawingml/2006/picture">
+                  <pic:nvPicPr>
+                    <pic:cNvPr id="1295488584" name=""/>
+                    <pic:cNvPicPr/>
+                  </pic:nvPicPr>
+                  <pic:blipFill>
+                    <a:blip r:embed="rId18"/>
+                    <a:stretch>
+                      <a:fillRect/>
+                    </a:stretch>
+                  </pic:blipFill>
+                  <pic:spPr>
+                    <a:xfrm>
+                      <a:off x="0" y="0"/>
+                      <a:ext cx="4273990" cy="3406805"/>
+                    </a:xfrm>
+                    <a:prstGeom prst="rect">
+                      <a:avLst/>
+                    </a:prstGeom>
+                  </pic:spPr>
+                </pic:pic>
+              </a:graphicData>
+            </a:graphic>
+          </wp:inline>
+        </w:drawing>
+      </w:r>
+    </w:p>
+    <w:p>
+      <w:pPr>
+        <w:rPr>
+          <w:rFonts w:ascii="Times New Roman" w:hAnsi="Times New Roman"/>
+          <w:b/>
+          <w:bCs/>
+          <w:sz w:val="28"/>
+        </w:rPr>
+      </w:pPr>
+      <w:r>
+        <w:rPr>
+          <w:rFonts w:ascii="Times New Roman" w:hAnsi="Times New Roman"/>
+          <w:b/>
+          <w:bCs/>
+          <w:sz w:val="28"/>
+        </w:rPr>
+        <w:lastRenderedPageBreak/>
         <w:br/>
-      </w:r>
+        <w:t>JAVASCRIPT 6:</w:t>
+      </w:r>
+      <w:r>
+        <w:rPr>
+          <w:rFonts w:ascii="Times New Roman" w:hAnsi="Times New Roman"/>
+          <w:b/>
+          <w:bCs/>
+          <w:sz w:val="28"/>
+        </w:rPr>
+        <w:t xml:space="preserve"> some(), ever() y reduce()</w:t>
+      </w:r>
+      <w:r>
+        <w:rPr>
+          <w:rFonts w:ascii="Times New Roman" w:hAnsi="Times New Roman"/>
+          <w:b/>
+          <w:bCs/>
+          <w:sz w:val="28"/>
+        </w:rPr>
+        <w:t xml:space="preserve"> </w:t>
+      </w:r>
+    </w:p>
+    <w:p>
+      <w:pPr>
+        <w:rPr>
+          <w:rFonts w:ascii="Times New Roman" w:hAnsi="Times New Roman"/>
+          <w:b/>
+          <w:bCs/>
+          <w:sz w:val="28"/>
+        </w:rPr>
+      </w:pPr>
+      <w:r>
+        <w:rPr>
+          <w:rFonts w:ascii="Times New Roman" w:hAnsi="Times New Roman"/>
+          <w:b/>
+          <w:bCs/>
+          <w:sz w:val="28"/>
+        </w:rPr>
+        <w:drawing>
+          <wp:inline distT="0" distB="0" distL="0" distR="0" wp14:anchorId="103828B6" wp14:editId="57C16E9C">
+            <wp:extent cx="4913906" cy="3134190"/>
+            <wp:effectExtent l="0" t="0" r="1270" b="9525"/>
+            <wp:docPr id="1276326311" name="Imagen 1"/>
+            <wp:cNvGraphicFramePr>
+              <a:graphicFrameLocks xmlns:a="http://schemas.openxmlformats.org/drawingml/2006/main" noChangeAspect="1"/>
+            </wp:cNvGraphicFramePr>
+            <a:graphic xmlns:a="http://schemas.openxmlformats.org/drawingml/2006/main">
+              <a:graphicData uri="http://schemas.openxmlformats.org/drawingml/2006/picture">
+                <pic:pic xmlns:pic="http://schemas.openxmlformats.org/drawingml/2006/picture">
+                  <pic:nvPicPr>
+                    <pic:cNvPr id="1276326311" name=""/>
+                    <pic:cNvPicPr/>
+                  </pic:nvPicPr>
+                  <pic:blipFill>
+                    <a:blip r:embed="rId19"/>
+                    <a:stretch>
+                      <a:fillRect/>
+                    </a:stretch>
+                  </pic:blipFill>
+                  <pic:spPr>
+                    <a:xfrm>
+                      <a:off x="0" y="0"/>
+                      <a:ext cx="4918428" cy="3137074"/>
+                    </a:xfrm>
+                    <a:prstGeom prst="rect">
+                      <a:avLst/>
+                    </a:prstGeom>
+                  </pic:spPr>
+                </pic:pic>
+              </a:graphicData>
+            </a:graphic>
+          </wp:inline>
+        </w:drawing>
+      </w:r>
+    </w:p>
+    <w:p>
+      <w:pPr>
+        <w:rPr>
+          <w:rFonts w:ascii="Times New Roman" w:hAnsi="Times New Roman"/>
+          <w:b/>
+          <w:bCs/>
+          <w:sz w:val="28"/>
+        </w:rPr>
+      </w:pPr>
+      <w:r>
+        <w:rPr>
+          <w:rFonts w:ascii="Times New Roman" w:hAnsi="Times New Roman"/>
+          <w:b/>
+          <w:bCs/>
+          <w:sz w:val="28"/>
+        </w:rPr>
+        <w:br w:type="page"/>
+      </w:r>
+    </w:p>
+    <w:p>
+      <w:pPr>
+        <w:rPr>
+          <w:rFonts w:ascii="Times New Roman" w:hAnsi="Times New Roman"/>
+          <w:sz w:val="28"/>
+        </w:rPr>
+      </w:pPr>
+      <w:r>
+        <w:rPr>
+          <w:rFonts w:ascii="Times New Roman" w:hAnsi="Times New Roman"/>
+          <w:b/>
+          <w:bCs/>
+          <w:sz w:val="28"/>
+        </w:rPr>
+        <w:lastRenderedPageBreak/>
+        <w:t xml:space="preserve">JAVASCRIPT 7: </w:t>
+      </w:r>
+      <w:r>
+        <w:rPr>
+          <w:rFonts w:ascii="Times New Roman" w:hAnsi="Times New Roman"/>
+          <w:sz w:val="28"/>
+        </w:rPr>
+        <w:t>Sintaxis moderna que React usa: Ternario</w:t>
+      </w:r>
+    </w:p>
+    <w:p>
+      <w:pPr>
+        <w:rPr>
+          <w:rFonts w:ascii="Times New Roman" w:hAnsi="Times New Roman"/>
+          <w:sz w:val="28"/>
+        </w:rPr>
+      </w:pPr>
+      <w:r>
+        <w:rPr>
+          <w:rFonts w:ascii="Times New Roman" w:hAnsi="Times New Roman"/>
+          <w:sz w:val="28"/>
+        </w:rPr>
+        <w:drawing>
+          <wp:inline distT="0" distB="0" distL="0" distR="0" wp14:anchorId="4BBC3D96" wp14:editId="07556741">
+            <wp:extent cx="3927944" cy="3446454"/>
+            <wp:effectExtent l="0" t="0" r="0" b="1905"/>
+            <wp:docPr id="93379684" name="Imagen 1"/>
+            <wp:cNvGraphicFramePr>
+              <a:graphicFrameLocks xmlns:a="http://schemas.openxmlformats.org/drawingml/2006/main" noChangeAspect="1"/>
+            </wp:cNvGraphicFramePr>
+            <a:graphic xmlns:a="http://schemas.openxmlformats.org/drawingml/2006/main">
+              <a:graphicData uri="http://schemas.openxmlformats.org/drawingml/2006/picture">
+                <pic:pic xmlns:pic="http://schemas.openxmlformats.org/drawingml/2006/picture">
+                  <pic:nvPicPr>
+                    <pic:cNvPr id="93379684" name=""/>
+                    <pic:cNvPicPr/>
+                  </pic:nvPicPr>
+                  <pic:blipFill>
+                    <a:blip r:embed="rId20"/>
+                    <a:stretch>
+                      <a:fillRect/>
+                    </a:stretch>
+                  </pic:blipFill>
+                  <pic:spPr>
+                    <a:xfrm>
+                      <a:off x="0" y="0"/>
+                      <a:ext cx="3933802" cy="3451594"/>
+                    </a:xfrm>
+                    <a:prstGeom prst="rect">
+                      <a:avLst/>
+                    </a:prstGeom>
+                  </pic:spPr>
+                </pic:pic>
+              </a:graphicData>
+            </a:graphic>
+          </wp:inline>
+        </w:drawing>
+      </w:r>
+    </w:p>
+    <w:p>
+      <w:pPr>
+        <w:rPr>
+          <w:rFonts w:ascii="Times New Roman" w:hAnsi="Times New Roman"/>
+          <w:sz w:val="28"/>
+        </w:rPr>
+      </w:pPr>
+    </w:p>
+    <w:p>
+      <w:pPr>
+        <w:rPr>
+          <w:rFonts w:ascii="Times New Roman" w:hAnsi="Times New Roman"/>
+          <w:sz w:val="28"/>
+        </w:rPr>
+      </w:pPr>
+      <w:r>
+        <w:rPr>
+          <w:rFonts w:ascii="Times New Roman" w:hAnsi="Times New Roman"/>
+          <w:b/>
+          <w:bCs/>
+          <w:sz w:val="28"/>
+        </w:rPr>
+        <w:t xml:space="preserve">REACT: </w:t>
+      </w:r>
+      <w:r>
+        <w:rPr>
+          <w:rFonts w:ascii="Times New Roman" w:hAnsi="Times New Roman"/>
+          <w:sz w:val="28"/>
+        </w:rPr>
+        <w:t>Separar datos y componentes</w:t>
+      </w:r>
+    </w:p>
+    <w:p>
+      <w:pPr>
+        <w:rPr>
+          <w:rFonts w:ascii="Times New Roman" w:hAnsi="Times New Roman"/>
+          <w:sz w:val="28"/>
+        </w:rPr>
+      </w:pPr>
+      <w:r>
+        <w:rPr>
+          <w:rFonts w:ascii="Times New Roman" w:hAnsi="Times New Roman"/>
+          <w:sz w:val="28"/>
+        </w:rPr>
+        <w:drawing>
+          <wp:inline distT="0" distB="0" distL="0" distR="0" wp14:anchorId="77173874" wp14:editId="5CAC9FDA">
+            <wp:extent cx="7116417" cy="2154555"/>
+            <wp:effectExtent l="0" t="0" r="8890" b="0"/>
+            <wp:docPr id="1594690731" name="Imagen 1"/>
+            <wp:cNvGraphicFramePr>
+              <a:graphicFrameLocks xmlns:a="http://schemas.openxmlformats.org/drawingml/2006/main" noChangeAspect="1"/>
+            </wp:cNvGraphicFramePr>
+            <a:graphic xmlns:a="http://schemas.openxmlformats.org/drawingml/2006/main">
+              <a:graphicData uri="http://schemas.openxmlformats.org/drawingml/2006/picture">
+                <pic:pic xmlns:pic="http://schemas.openxmlformats.org/drawingml/2006/picture">
+                  <pic:nvPicPr>
+                    <pic:cNvPr id="1594690731" name=""/>
+                    <pic:cNvPicPr/>
+                  </pic:nvPicPr>
+                  <pic:blipFill>
+                    <a:blip r:embed="rId21"/>
+                    <a:stretch>
+                      <a:fillRect/>
+                    </a:stretch>
+                  </pic:blipFill>
+                  <pic:spPr>
+                    <a:xfrm>
+                      <a:off x="0" y="0"/>
+                      <a:ext cx="7174686" cy="2172196"/>
+                    </a:xfrm>
+                    <a:prstGeom prst="rect">
+                      <a:avLst/>
+                    </a:prstGeom>
+                  </pic:spPr>
+                </pic:pic>
+              </a:graphicData>
+            </a:graphic>
+          </wp:inline>
+        </w:drawing>
+      </w:r>
+    </w:p>
+    <w:p>
+      <w:pPr>
+        <w:rPr>
+          <w:rFonts w:ascii="Times New Roman" w:hAnsi="Times New Roman"/>
+          <w:sz w:val="28"/>
+        </w:rPr>
+      </w:pPr>
+      <w:r>
+        <w:rPr>
+          <w:rFonts w:ascii="Times New Roman" w:hAnsi="Times New Roman"/>
+          <w:sz w:val="28"/>
+        </w:rPr>
+        <w:br w:type="page"/>
+      </w:r>
+    </w:p>
+    <w:p>
+      <w:pPr>
+        <w:rPr>
+          <w:rFonts w:ascii="Times New Roman" w:hAnsi="Times New Roman"/>
+          <w:sz w:val="28"/>
+        </w:rPr>
+      </w:pPr>
+      <w:r>
+        <w:rPr>
+          <w:rFonts w:ascii="Times New Roman" w:hAnsi="Times New Roman"/>
+          <w:b/>
+          <w:bCs/>
+          <w:sz w:val="28"/>
+        </w:rPr>
+        <w:lastRenderedPageBreak/>
+        <w:t>REACT</w:t>
+      </w:r>
+      <w:r>
+        <w:rPr>
+          <w:rFonts w:ascii="Times New Roman" w:hAnsi="Times New Roman"/>
+          <w:b/>
+          <w:bCs/>
+          <w:sz w:val="28"/>
+        </w:rPr>
+        <w:t xml:space="preserve">: </w:t>
+      </w:r>
+      <w:r>
+        <w:rPr>
+          <w:rFonts w:ascii="Times New Roman" w:hAnsi="Times New Roman"/>
+          <w:sz w:val="28"/>
+        </w:rPr>
+        <w:t>Mostrar la lista con map() y key</w:t>
+      </w:r>
+    </w:p>
+    <w:p>
+      <w:pPr>
+        <w:rPr>
+          <w:rFonts w:ascii="Times New Roman" w:hAnsi="Times New Roman"/>
+          <w:sz w:val="28"/>
+        </w:rPr>
+      </w:pPr>
+      <w:r>
+        <w:rPr>
+          <w:rFonts w:ascii="Times New Roman" w:hAnsi="Times New Roman"/>
+          <w:sz w:val="28"/>
+        </w:rPr>
+        <w:drawing>
+          <wp:inline distT="0" distB="0" distL="0" distR="0" wp14:anchorId="0E9F9230" wp14:editId="2A54BD75">
+            <wp:extent cx="6891543" cy="2456953"/>
+            <wp:effectExtent l="0" t="0" r="5080" b="635"/>
+            <wp:docPr id="1349575537" name="Imagen 1"/>
+            <wp:cNvGraphicFramePr>
+              <a:graphicFrameLocks xmlns:a="http://schemas.openxmlformats.org/drawingml/2006/main" noChangeAspect="1"/>
+            </wp:cNvGraphicFramePr>
+            <a:graphic xmlns:a="http://schemas.openxmlformats.org/drawingml/2006/main">
+              <a:graphicData uri="http://schemas.openxmlformats.org/drawingml/2006/picture">
+                <pic:pic xmlns:pic="http://schemas.openxmlformats.org/drawingml/2006/picture">
+                  <pic:nvPicPr>
+                    <pic:cNvPr id="1349575537" name=""/>
+                    <pic:cNvPicPr/>
+                  </pic:nvPicPr>
+                  <pic:blipFill>
+                    <a:blip r:embed="rId22"/>
+                    <a:stretch>
+                      <a:fillRect/>
+                    </a:stretch>
+                  </pic:blipFill>
+                  <pic:spPr>
+                    <a:xfrm>
+                      <a:off x="0" y="0"/>
+                      <a:ext cx="6907141" cy="2462514"/>
+                    </a:xfrm>
+                    <a:prstGeom prst="rect">
+                      <a:avLst/>
+                    </a:prstGeom>
+                  </pic:spPr>
+                </pic:pic>
+              </a:graphicData>
+            </a:graphic>
+          </wp:inline>
+        </w:drawing>
+      </w:r>
+    </w:p>
+    <w:p>
+      <w:pPr>
+        <w:rPr>
+          <w:rFonts w:ascii="Times New Roman" w:hAnsi="Times New Roman"/>
+          <w:sz w:val="28"/>
+        </w:rPr>
+      </w:pPr>
+      <w:r>
+        <w:rPr>
+          <w:rFonts w:ascii="Times New Roman" w:hAnsi="Times New Roman"/>
+          <w:b/>
+          <w:bCs/>
+          <w:sz w:val="28"/>
+        </w:rPr>
+        <w:t xml:space="preserve">GIT: </w:t>
+      </w:r>
+      <w:r>
+        <w:rPr>
+          <w:rFonts w:ascii="Times New Roman" w:hAnsi="Times New Roman"/>
+          <w:sz w:val="28"/>
+        </w:rPr>
+        <w:t>Crear el historial local</w:t>
+      </w:r>
+      <w:r>
+        <w:rPr>
+          <w:rFonts w:ascii="Times New Roman" w:hAnsi="Times New Roman"/>
+          <w:sz w:val="28"/>
+        </w:rPr>
+        <w:br/>
+      </w:r>
+      <w:r>
+        <w:rPr>
+          <w:rFonts w:ascii="Times New Roman" w:hAnsi="Times New Roman"/>
+          <w:sz w:val="28"/>
+        </w:rPr>
+        <w:drawing>
+          <wp:inline distT="0" distB="0" distL="0" distR="0" wp14:anchorId="23E0CAA4" wp14:editId="01CAC5FB">
+            <wp:extent cx="5772956" cy="2753109"/>
+            <wp:effectExtent l="0" t="0" r="0" b="9525"/>
+            <wp:docPr id="1455951015" name="Imagen 1"/>
+            <wp:cNvGraphicFramePr>
+              <a:graphicFrameLocks xmlns:a="http://schemas.openxmlformats.org/drawingml/2006/main" noChangeAspect="1"/>
+            </wp:cNvGraphicFramePr>
+            <a:graphic xmlns:a="http://schemas.openxmlformats.org/drawingml/2006/main">
+              <a:graphicData uri="http://schemas.openxmlformats.org/drawingml/2006/picture">
+                <pic:pic xmlns:pic="http://schemas.openxmlformats.org/drawingml/2006/picture">
+                  <pic:nvPicPr>
+                    <pic:cNvPr id="1455951015" name=""/>
+                    <pic:cNvPicPr/>
+                  </pic:nvPicPr>
+                  <pic:blipFill>
+                    <a:blip r:embed="rId23"/>
+                    <a:stretch>
+                      <a:fillRect/>
+                    </a:stretch>
+                  </pic:blipFill>
+                  <pic:spPr>
+                    <a:xfrm>
+                      <a:off x="0" y="0"/>
+                      <a:ext cx="5772956" cy="2753109"/>
+                    </a:xfrm>
+                    <a:prstGeom prst="rect">
+                      <a:avLst/>
+                    </a:prstGeom>
+                  </pic:spPr>
+                </pic:pic>
+              </a:graphicData>
+            </a:graphic>
+          </wp:inline>
+        </w:drawing>
+      </w:r>
+    </w:p>
+    <w:p>
+      <w:pPr>
+        <w:rPr>
+          <w:rFonts w:ascii="Times New Roman" w:hAnsi="Times New Roman"/>
+          <w:sz w:val="28"/>
+        </w:rPr>
+      </w:pPr>
+      <w:r>
+        <w:rPr>
+          <w:rFonts w:ascii="Times New Roman" w:hAnsi="Times New Roman"/>
+          <w:sz w:val="28"/>
+        </w:rPr>
+        <w:t>Se verifica que si es un repositorio de Git.</w:t>
+      </w:r>
+    </w:p>
+    <w:p>
+      <w:pPr>
+        <w:rPr>
+          <w:rFonts w:ascii="Times New Roman" w:hAnsi="Times New Roman"/>
+          <w:sz w:val="28"/>
+        </w:rPr>
+      </w:pPr>
+      <w:r>
+        <w:rPr>
+          <w:rFonts w:ascii="Times New Roman" w:hAnsi="Times New Roman"/>
+          <w:sz w:val="28"/>
+        </w:rPr>
+        <w:br w:type="page"/>
+      </w:r>
+    </w:p>
+    <w:p>
+      <w:pPr>
+        <w:rPr>
+          <w:rFonts w:ascii="Times New Roman" w:hAnsi="Times New Roman"/>
+          <w:sz w:val="28"/>
+        </w:rPr>
+      </w:pPr>
     </w:p>
     <w:sectPr>
       <w:pgSz w:w="12240" w:h="15840"/>

</xml_diff>

<commit_message>
Se agrego el link de Github en el documento con las evidencias y capturas de pantalla de todo el taller
</commit_message>
<xml_diff>
--- a/RETOS_JAVASCRIPT_PRESENTACION.docx
+++ b/RETOS_JAVASCRIPT_PRESENTACION.docx
@@ -87,6 +87,27 @@
           <w:sz w:val="28"/>
         </w:rPr>
       </w:pPr>
+      <w:r>
+        <w:rPr>
+          <w:rFonts w:ascii="Times New Roman" w:hAnsi="Times New Roman"/>
+          <w:b/>
+          <w:bCs/>
+          <w:sz w:val="28"/>
+        </w:rPr>
+        <w:t xml:space="preserve">GITHUB: </w:t>
+      </w:r>
+      <w:hyperlink r:id="rId4" w:history="1">
+        <w:r>
+          <w:rPr>
+            <w:rStyle w:val="Hipervnculo"/>
+            <w:rFonts w:ascii="Times New Roman" w:hAnsi="Times New Roman"/>
+            <w:b/>
+            <w:bCs/>
+            <w:sz w:val="28"/>
+          </w:rPr>
+          <w:t>https://github.com/DonJuan4-6/tienda-reactv2.git</w:t>
+        </w:r>
+      </w:hyperlink>
     </w:p>
     <w:p>
       <w:pPr>
@@ -140,7 +161,7 @@
                     <pic:cNvPicPr/>
                   </pic:nvPicPr>
                   <pic:blipFill>
-                    <a:blip r:embed="rId4"/>
+                    <a:blip r:embed="rId5"/>
                     <a:stretch>
                       <a:fillRect/>
                     </a:stretch>
@@ -211,7 +232,7 @@
                     <pic:cNvPicPr/>
                   </pic:nvPicPr>
                   <pic:blipFill>
-                    <a:blip r:embed="rId5"/>
+                    <a:blip r:embed="rId6"/>
                     <a:stretch>
                       <a:fillRect/>
                     </a:stretch>
@@ -283,7 +304,7 @@
                     <pic:cNvPicPr/>
                   </pic:nvPicPr>
                   <pic:blipFill>
-                    <a:blip r:embed="rId6"/>
+                    <a:blip r:embed="rId7"/>
                     <a:stretch>
                       <a:fillRect/>
                     </a:stretch>
@@ -335,8 +356,17 @@
           <w:rFonts w:ascii="Times New Roman" w:hAnsi="Times New Roman"/>
           <w:sz w:val="28"/>
         </w:rPr>
-        <w:t>Funciones, parámetros y return</w:t>
-      </w:r>
+        <w:t xml:space="preserve">Funciones, parámetros y </w:t>
+      </w:r>
+      <w:proofErr w:type="spellStart"/>
+      <w:r>
+        <w:rPr>
+          <w:rFonts w:ascii="Times New Roman" w:hAnsi="Times New Roman"/>
+          <w:sz w:val="28"/>
+        </w:rPr>
+        <w:t>return</w:t>
+      </w:r>
+      <w:proofErr w:type="spellEnd"/>
     </w:p>
     <w:p>
       <w:pPr>
@@ -371,7 +401,7 @@
                     <pic:cNvPicPr/>
                   </pic:nvPicPr>
                   <pic:blipFill>
-                    <a:blip r:embed="rId7"/>
+                    <a:blip r:embed="rId8"/>
                     <a:stretch>
                       <a:fillRect/>
                     </a:stretch>
@@ -413,7 +443,23 @@
           <w:rFonts w:ascii="Times New Roman" w:hAnsi="Times New Roman"/>
           <w:sz w:val="28"/>
         </w:rPr>
-        <w:t>Funciones sumar, restar, multiplicar, dividir y promedio. Además, explicación de la diferencia entre ‘Return’ y ‘console.log’</w:t>
+        <w:t>Funciones sumar, restar, multiplicar, dividir y promedio. Además, explicación de la diferencia entre ‘</w:t>
+      </w:r>
+      <w:proofErr w:type="spellStart"/>
+      <w:r>
+        <w:rPr>
+          <w:rFonts w:ascii="Times New Roman" w:hAnsi="Times New Roman"/>
+          <w:sz w:val="28"/>
+        </w:rPr>
+        <w:t>Return</w:t>
+      </w:r>
+      <w:proofErr w:type="spellEnd"/>
+      <w:r>
+        <w:rPr>
+          <w:rFonts w:ascii="Times New Roman" w:hAnsi="Times New Roman"/>
+          <w:sz w:val="28"/>
+        </w:rPr>
+        <w:t>’ y ‘console.log’</w:t>
       </w:r>
     </w:p>
     <w:p>
@@ -449,7 +495,7 @@
                     <pic:cNvPicPr/>
                   </pic:nvPicPr>
                   <pic:blipFill>
-                    <a:blip r:embed="rId8"/>
+                    <a:blip r:embed="rId9"/>
                     <a:stretch>
                       <a:fillRect/>
                     </a:stretch>
@@ -507,7 +553,7 @@
                     <pic:cNvPicPr/>
                   </pic:nvPicPr>
                   <pic:blipFill>
-                    <a:blip r:embed="rId9"/>
+                    <a:blip r:embed="rId10"/>
                     <a:stretch>
                       <a:fillRect/>
                     </a:stretch>
@@ -580,7 +626,7 @@
                     <pic:cNvPicPr/>
                   </pic:nvPicPr>
                   <pic:blipFill>
-                    <a:blip r:embed="rId10"/>
+                    <a:blip r:embed="rId11"/>
                     <a:stretch>
                       <a:fillRect/>
                     </a:stretch>
@@ -642,7 +688,39 @@
           <w:rFonts w:ascii="Times New Roman" w:hAnsi="Times New Roman"/>
           <w:sz w:val="28"/>
         </w:rPr>
-        <w:t>Las funciones: cuadrado, esMayorEdad, nombreCompleto convertirlas a función tipo flecha.</w:t>
+        <w:t xml:space="preserve">Las funciones: cuadrado, </w:t>
+      </w:r>
+      <w:proofErr w:type="spellStart"/>
+      <w:r>
+        <w:rPr>
+          <w:rFonts w:ascii="Times New Roman" w:hAnsi="Times New Roman"/>
+          <w:sz w:val="28"/>
+        </w:rPr>
+        <w:t>esMayorEdad</w:t>
+      </w:r>
+      <w:proofErr w:type="spellEnd"/>
+      <w:r>
+        <w:rPr>
+          <w:rFonts w:ascii="Times New Roman" w:hAnsi="Times New Roman"/>
+          <w:sz w:val="28"/>
+        </w:rPr>
+        <w:t xml:space="preserve">, </w:t>
+      </w:r>
+      <w:proofErr w:type="spellStart"/>
+      <w:r>
+        <w:rPr>
+          <w:rFonts w:ascii="Times New Roman" w:hAnsi="Times New Roman"/>
+          <w:sz w:val="28"/>
+        </w:rPr>
+        <w:t>nombreCompleto</w:t>
+      </w:r>
+      <w:proofErr w:type="spellEnd"/>
+      <w:r>
+        <w:rPr>
+          <w:rFonts w:ascii="Times New Roman" w:hAnsi="Times New Roman"/>
+          <w:sz w:val="28"/>
+        </w:rPr>
+        <w:t xml:space="preserve"> convertirlas a función tipo flecha.</w:t>
       </w:r>
       <w:r>
         <w:rPr>
@@ -672,7 +750,7 @@
                     <pic:cNvPicPr/>
                   </pic:nvPicPr>
                   <pic:blipFill>
-                    <a:blip r:embed="rId11"/>
+                    <a:blip r:embed="rId12"/>
                     <a:stretch>
                       <a:fillRect/>
                     </a:stretch>
@@ -721,7 +799,7 @@
                     <pic:cNvPicPr/>
                   </pic:nvPicPr>
                   <pic:blipFill>
-                    <a:blip r:embed="rId12"/>
+                    <a:blip r:embed="rId13"/>
                     <a:stretch>
                       <a:fillRect/>
                     </a:stretch>
@@ -779,7 +857,23 @@
           <w:rFonts w:ascii="Times New Roman" w:hAnsi="Times New Roman"/>
           <w:sz w:val="28"/>
         </w:rPr>
-        <w:t>Arreglos de objetos; agregar 7 objetos mas sin repetir id:</w:t>
+        <w:t xml:space="preserve">Arreglos de objetos; agregar 7 objetos </w:t>
+      </w:r>
+      <w:proofErr w:type="spellStart"/>
+      <w:r>
+        <w:rPr>
+          <w:rFonts w:ascii="Times New Roman" w:hAnsi="Times New Roman"/>
+          <w:sz w:val="28"/>
+        </w:rPr>
+        <w:t>mas</w:t>
+      </w:r>
+      <w:proofErr w:type="spellEnd"/>
+      <w:r>
+        <w:rPr>
+          <w:rFonts w:ascii="Times New Roman" w:hAnsi="Times New Roman"/>
+          <w:sz w:val="28"/>
+        </w:rPr>
+        <w:t xml:space="preserve"> sin repetir id:</w:t>
       </w:r>
       <w:r>
         <w:rPr>
@@ -810,7 +904,7 @@
                     <pic:cNvPicPr/>
                   </pic:nvPicPr>
                   <pic:blipFill>
-                    <a:blip r:embed="rId13"/>
+                    <a:blip r:embed="rId14"/>
                     <a:stretch>
                       <a:fillRect/>
                     </a:stretch>
@@ -847,12 +941,55 @@
         </w:rPr>
         <w:t xml:space="preserve">JAVASCRIPT 4: </w:t>
       </w:r>
-      <w:r>
-        <w:rPr>
-          <w:rFonts w:ascii="Times New Roman" w:hAnsi="Times New Roman"/>
-          <w:sz w:val="28"/>
-        </w:rPr>
-        <w:t>ForEach() vs map()</w:t>
+      <w:proofErr w:type="spellStart"/>
+      <w:proofErr w:type="gramStart"/>
+      <w:r>
+        <w:rPr>
+          <w:rFonts w:ascii="Times New Roman" w:hAnsi="Times New Roman"/>
+          <w:sz w:val="28"/>
+        </w:rPr>
+        <w:t>ForEach</w:t>
+      </w:r>
+      <w:proofErr w:type="spellEnd"/>
+      <w:r>
+        <w:rPr>
+          <w:rFonts w:ascii="Times New Roman" w:hAnsi="Times New Roman"/>
+          <w:sz w:val="28"/>
+        </w:rPr>
+        <w:t>(</w:t>
+      </w:r>
+      <w:proofErr w:type="gramEnd"/>
+      <w:r>
+        <w:rPr>
+          <w:rFonts w:ascii="Times New Roman" w:hAnsi="Times New Roman"/>
+          <w:sz w:val="28"/>
+        </w:rPr>
+        <w:t xml:space="preserve">) vs </w:t>
+      </w:r>
+      <w:proofErr w:type="spellStart"/>
+      <w:proofErr w:type="gramStart"/>
+      <w:r>
+        <w:rPr>
+          <w:rFonts w:ascii="Times New Roman" w:hAnsi="Times New Roman"/>
+          <w:sz w:val="28"/>
+        </w:rPr>
+        <w:t>map</w:t>
+      </w:r>
+      <w:proofErr w:type="spellEnd"/>
+      <w:r>
+        <w:rPr>
+          <w:rFonts w:ascii="Times New Roman" w:hAnsi="Times New Roman"/>
+          <w:sz w:val="28"/>
+        </w:rPr>
+        <w:t>(</w:t>
+      </w:r>
+      <w:proofErr w:type="gramEnd"/>
+      <w:r>
+        <w:rPr>
+          <w:rFonts w:ascii="Times New Roman" w:hAnsi="Times New Roman"/>
+          <w:sz w:val="28"/>
+        </w:rPr>
+        <w:t>)</w:t>
       </w:r>
     </w:p>
     <w:p>
@@ -891,7 +1028,7 @@
                     <pic:cNvPicPr/>
                   </pic:nvPicPr>
                   <pic:blipFill>
-                    <a:blip r:embed="rId14"/>
+                    <a:blip r:embed="rId15"/>
                     <a:stretch>
                       <a:fillRect/>
                     </a:stretch>
@@ -921,6 +1058,8 @@
           <w:sz w:val="28"/>
         </w:rPr>
       </w:pPr>
+      <w:proofErr w:type="spellStart"/>
+      <w:proofErr w:type="gramStart"/>
       <w:r>
         <w:rPr>
           <w:rFonts w:ascii="Times New Roman" w:hAnsi="Times New Roman"/>
@@ -929,7 +1068,27 @@
           <w:sz w:val="28"/>
         </w:rPr>
         <w:lastRenderedPageBreak/>
-        <w:t>map()</w:t>
+        <w:t>map</w:t>
+      </w:r>
+      <w:proofErr w:type="spellEnd"/>
+      <w:r>
+        <w:rPr>
+          <w:rFonts w:ascii="Times New Roman" w:hAnsi="Times New Roman"/>
+          <w:b/>
+          <w:bCs/>
+          <w:sz w:val="28"/>
+        </w:rPr>
+        <w:t>(</w:t>
+      </w:r>
+      <w:proofErr w:type="gramEnd"/>
+      <w:r>
+        <w:rPr>
+          <w:rFonts w:ascii="Times New Roman" w:hAnsi="Times New Roman"/>
+          <w:b/>
+          <w:bCs/>
+          <w:sz w:val="28"/>
+        </w:rPr>
+        <w:t>)</w:t>
       </w:r>
     </w:p>
     <w:p>
@@ -961,7 +1120,7 @@
                     <pic:cNvPicPr/>
                   </pic:nvPicPr>
                   <pic:blipFill>
-                    <a:blip r:embed="rId15"/>
+                    <a:blip r:embed="rId16"/>
                     <a:stretch>
                       <a:fillRect/>
                     </a:stretch>
@@ -1010,7 +1169,7 @@
                     <pic:cNvPicPr/>
                   </pic:nvPicPr>
                   <pic:blipFill>
-                    <a:blip r:embed="rId16"/>
+                    <a:blip r:embed="rId17"/>
                     <a:stretch>
                       <a:fillRect/>
                     </a:stretch>
@@ -1060,7 +1219,7 @@
                     <pic:cNvPicPr/>
                   </pic:nvPicPr>
                   <pic:blipFill>
-                    <a:blip r:embed="rId17"/>
+                    <a:blip r:embed="rId18"/>
                     <a:stretch>
                       <a:fillRect/>
                     </a:stretch>
@@ -1099,14 +1258,67 @@
         </w:rPr>
         <w:t xml:space="preserve">JAVASCRIPT 5: </w:t>
       </w:r>
-      <w:r>
-        <w:rPr>
-          <w:rFonts w:ascii="Times New Roman" w:hAnsi="Times New Roman"/>
-          <w:b/>
-          <w:bCs/>
-          <w:sz w:val="28"/>
-        </w:rPr>
-        <w:t>filter() y find()</w:t>
+      <w:proofErr w:type="spellStart"/>
+      <w:proofErr w:type="gramStart"/>
+      <w:r>
+        <w:rPr>
+          <w:rFonts w:ascii="Times New Roman" w:hAnsi="Times New Roman"/>
+          <w:b/>
+          <w:bCs/>
+          <w:sz w:val="28"/>
+        </w:rPr>
+        <w:t>filter</w:t>
+      </w:r>
+      <w:proofErr w:type="spellEnd"/>
+      <w:r>
+        <w:rPr>
+          <w:rFonts w:ascii="Times New Roman" w:hAnsi="Times New Roman"/>
+          <w:b/>
+          <w:bCs/>
+          <w:sz w:val="28"/>
+        </w:rPr>
+        <w:t>(</w:t>
+      </w:r>
+      <w:proofErr w:type="gramEnd"/>
+      <w:r>
+        <w:rPr>
+          <w:rFonts w:ascii="Times New Roman" w:hAnsi="Times New Roman"/>
+          <w:b/>
+          <w:bCs/>
+          <w:sz w:val="28"/>
+        </w:rPr>
+        <w:t xml:space="preserve">) y </w:t>
+      </w:r>
+      <w:proofErr w:type="spellStart"/>
+      <w:proofErr w:type="gramStart"/>
+      <w:r>
+        <w:rPr>
+          <w:rFonts w:ascii="Times New Roman" w:hAnsi="Times New Roman"/>
+          <w:b/>
+          <w:bCs/>
+          <w:sz w:val="28"/>
+        </w:rPr>
+        <w:t>find</w:t>
+      </w:r>
+      <w:proofErr w:type="spellEnd"/>
+      <w:r>
+        <w:rPr>
+          <w:rFonts w:ascii="Times New Roman" w:hAnsi="Times New Roman"/>
+          <w:b/>
+          <w:bCs/>
+          <w:sz w:val="28"/>
+        </w:rPr>
+        <w:t>(</w:t>
+      </w:r>
+      <w:proofErr w:type="gramEnd"/>
+      <w:r>
+        <w:rPr>
+          <w:rFonts w:ascii="Times New Roman" w:hAnsi="Times New Roman"/>
+          <w:b/>
+          <w:bCs/>
+          <w:sz w:val="28"/>
+        </w:rPr>
+        <w:t>)</w:t>
       </w:r>
       <w:r>
         <w:rPr>
@@ -1139,7 +1351,7 @@
                     <pic:cNvPicPr/>
                   </pic:nvPicPr>
                   <pic:blipFill>
-                    <a:blip r:embed="rId18"/>
+                    <a:blip r:embed="rId19"/>
                     <a:stretch>
                       <a:fillRect/>
                     </a:stretch>
@@ -1187,7 +1399,89 @@
           <w:bCs/>
           <w:sz w:val="28"/>
         </w:rPr>
-        <w:t xml:space="preserve"> some(), ever() y reduce()</w:t>
+        <w:t xml:space="preserve"> </w:t>
+      </w:r>
+      <w:proofErr w:type="spellStart"/>
+      <w:proofErr w:type="gramStart"/>
+      <w:r>
+        <w:rPr>
+          <w:rFonts w:ascii="Times New Roman" w:hAnsi="Times New Roman"/>
+          <w:b/>
+          <w:bCs/>
+          <w:sz w:val="28"/>
+        </w:rPr>
+        <w:t>some</w:t>
+      </w:r>
+      <w:proofErr w:type="spellEnd"/>
+      <w:r>
+        <w:rPr>
+          <w:rFonts w:ascii="Times New Roman" w:hAnsi="Times New Roman"/>
+          <w:b/>
+          <w:bCs/>
+          <w:sz w:val="28"/>
+        </w:rPr>
+        <w:t>(</w:t>
+      </w:r>
+      <w:proofErr w:type="gramEnd"/>
+      <w:r>
+        <w:rPr>
+          <w:rFonts w:ascii="Times New Roman" w:hAnsi="Times New Roman"/>
+          <w:b/>
+          <w:bCs/>
+          <w:sz w:val="28"/>
+        </w:rPr>
+        <w:t xml:space="preserve">), </w:t>
+      </w:r>
+      <w:proofErr w:type="spellStart"/>
+      <w:proofErr w:type="gramStart"/>
+      <w:r>
+        <w:rPr>
+          <w:rFonts w:ascii="Times New Roman" w:hAnsi="Times New Roman"/>
+          <w:b/>
+          <w:bCs/>
+          <w:sz w:val="28"/>
+        </w:rPr>
+        <w:t>ever</w:t>
+      </w:r>
+      <w:proofErr w:type="spellEnd"/>
+      <w:r>
+        <w:rPr>
+          <w:rFonts w:ascii="Times New Roman" w:hAnsi="Times New Roman"/>
+          <w:b/>
+          <w:bCs/>
+          <w:sz w:val="28"/>
+        </w:rPr>
+        <w:t>(</w:t>
+      </w:r>
+      <w:proofErr w:type="gramEnd"/>
+      <w:r>
+        <w:rPr>
+          <w:rFonts w:ascii="Times New Roman" w:hAnsi="Times New Roman"/>
+          <w:b/>
+          <w:bCs/>
+          <w:sz w:val="28"/>
+        </w:rPr>
+        <w:t xml:space="preserve">) y </w:t>
+      </w:r>
+      <w:proofErr w:type="gramStart"/>
+      <w:r>
+        <w:rPr>
+          <w:rFonts w:ascii="Times New Roman" w:hAnsi="Times New Roman"/>
+          <w:b/>
+          <w:bCs/>
+          <w:sz w:val="28"/>
+        </w:rPr>
+        <w:t>reduce(</w:t>
+      </w:r>
+      <w:proofErr w:type="gramEnd"/>
+      <w:r>
+        <w:rPr>
+          <w:rFonts w:ascii="Times New Roman" w:hAnsi="Times New Roman"/>
+          <w:b/>
+          <w:bCs/>
+          <w:sz w:val="28"/>
+        </w:rPr>
+        <w:t>)</w:t>
       </w:r>
       <w:r>
         <w:rPr>
@@ -1231,7 +1525,7 @@
                     <pic:cNvPicPr/>
                   </pic:nvPicPr>
                   <pic:blipFill>
-                    <a:blip r:embed="rId19"/>
+                    <a:blip r:embed="rId20"/>
                     <a:stretch>
                       <a:fillRect/>
                     </a:stretch>
@@ -1293,7 +1587,23 @@
           <w:rFonts w:ascii="Times New Roman" w:hAnsi="Times New Roman"/>
           <w:sz w:val="28"/>
         </w:rPr>
-        <w:t>Sintaxis moderna que React usa: Ternario</w:t>
+        <w:t xml:space="preserve">Sintaxis moderna que </w:t>
+      </w:r>
+      <w:proofErr w:type="spellStart"/>
+      <w:r>
+        <w:rPr>
+          <w:rFonts w:ascii="Times New Roman" w:hAnsi="Times New Roman"/>
+          <w:sz w:val="28"/>
+        </w:rPr>
+        <w:t>React</w:t>
+      </w:r>
+      <w:proofErr w:type="spellEnd"/>
+      <w:r>
+        <w:rPr>
+          <w:rFonts w:ascii="Times New Roman" w:hAnsi="Times New Roman"/>
+          <w:sz w:val="28"/>
+        </w:rPr>
+        <w:t xml:space="preserve"> usa: Ternario</w:t>
       </w:r>
     </w:p>
     <w:p>
@@ -1324,7 +1634,7 @@
                     <pic:cNvPicPr/>
                   </pic:nvPicPr>
                   <pic:blipFill>
-                    <a:blip r:embed="rId20"/>
+                    <a:blip r:embed="rId21"/>
                     <a:stretch>
                       <a:fillRect/>
                     </a:stretch>
@@ -1405,7 +1715,7 @@
                     <pic:cNvPicPr/>
                   </pic:nvPicPr>
                   <pic:blipFill>
-                    <a:blip r:embed="rId21"/>
+                    <a:blip r:embed="rId22"/>
                     <a:stretch>
                       <a:fillRect/>
                     </a:stretch>
@@ -1472,8 +1782,42 @@
           <w:rFonts w:ascii="Times New Roman" w:hAnsi="Times New Roman"/>
           <w:sz w:val="28"/>
         </w:rPr>
-        <w:t>Mostrar la lista con map() y key</w:t>
-      </w:r>
+        <w:t xml:space="preserve">Mostrar la lista con </w:t>
+      </w:r>
+      <w:proofErr w:type="spellStart"/>
+      <w:proofErr w:type="gramStart"/>
+      <w:r>
+        <w:rPr>
+          <w:rFonts w:ascii="Times New Roman" w:hAnsi="Times New Roman"/>
+          <w:sz w:val="28"/>
+        </w:rPr>
+        <w:t>map</w:t>
+      </w:r>
+      <w:proofErr w:type="spellEnd"/>
+      <w:r>
+        <w:rPr>
+          <w:rFonts w:ascii="Times New Roman" w:hAnsi="Times New Roman"/>
+          <w:sz w:val="28"/>
+        </w:rPr>
+        <w:t>(</w:t>
+      </w:r>
+      <w:proofErr w:type="gramEnd"/>
+      <w:r>
+        <w:rPr>
+          <w:rFonts w:ascii="Times New Roman" w:hAnsi="Times New Roman"/>
+          <w:sz w:val="28"/>
+        </w:rPr>
+        <w:t xml:space="preserve">) y </w:t>
+      </w:r>
+      <w:proofErr w:type="spellStart"/>
+      <w:r>
+        <w:rPr>
+          <w:rFonts w:ascii="Times New Roman" w:hAnsi="Times New Roman"/>
+          <w:sz w:val="28"/>
+        </w:rPr>
+        <w:t>key</w:t>
+      </w:r>
+      <w:proofErr w:type="spellEnd"/>
     </w:p>
     <w:p>
       <w:pPr>
@@ -1503,7 +1847,7 @@
                     <pic:cNvPicPr/>
                   </pic:nvPicPr>
                   <pic:blipFill>
-                    <a:blip r:embed="rId22"/>
+                    <a:blip r:embed="rId23"/>
                     <a:stretch>
                       <a:fillRect/>
                     </a:stretch>
@@ -1575,7 +1919,7 @@
                     <pic:cNvPicPr/>
                   </pic:nvPicPr>
                   <pic:blipFill>
-                    <a:blip r:embed="rId23"/>
+                    <a:blip r:embed="rId24"/>
                     <a:stretch>
                       <a:fillRect/>
                     </a:stretch>
@@ -1623,16 +1967,43 @@
           <w:rFonts w:ascii="Times New Roman" w:hAnsi="Times New Roman"/>
           <w:sz w:val="28"/>
         </w:rPr>
-        <w:br w:type="page"/>
-      </w:r>
-    </w:p>
-    <w:p>
-      <w:pPr>
-        <w:rPr>
-          <w:rFonts w:ascii="Times New Roman" w:hAnsi="Times New Roman"/>
-          <w:sz w:val="28"/>
-        </w:rPr>
-      </w:pPr>
+        <w:lastRenderedPageBreak/>
+        <w:drawing>
+          <wp:inline distT="0" distB="0" distL="0" distR="0" wp14:anchorId="214530E7" wp14:editId="10392D8C">
+            <wp:extent cx="6647212" cy="3442915"/>
+            <wp:effectExtent l="0" t="0" r="1270" b="5715"/>
+            <wp:docPr id="2074655273" name="Imagen 1"/>
+            <wp:cNvGraphicFramePr>
+              <a:graphicFrameLocks xmlns:a="http://schemas.openxmlformats.org/drawingml/2006/main" noChangeAspect="1"/>
+            </wp:cNvGraphicFramePr>
+            <a:graphic xmlns:a="http://schemas.openxmlformats.org/drawingml/2006/main">
+              <a:graphicData uri="http://schemas.openxmlformats.org/drawingml/2006/picture">
+                <pic:pic xmlns:pic="http://schemas.openxmlformats.org/drawingml/2006/picture">
+                  <pic:nvPicPr>
+                    <pic:cNvPr id="2074655273" name=""/>
+                    <pic:cNvPicPr/>
+                  </pic:nvPicPr>
+                  <pic:blipFill>
+                    <a:blip r:embed="rId25"/>
+                    <a:stretch>
+                      <a:fillRect/>
+                    </a:stretch>
+                  </pic:blipFill>
+                  <pic:spPr>
+                    <a:xfrm>
+                      <a:off x="0" y="0"/>
+                      <a:ext cx="6675009" cy="3457312"/>
+                    </a:xfrm>
+                    <a:prstGeom prst="rect">
+                      <a:avLst/>
+                    </a:prstGeom>
+                  </pic:spPr>
+                </pic:pic>
+              </a:graphicData>
+            </a:graphic>
+          </wp:inline>
+        </w:drawing>
+      </w:r>
     </w:p>
     <w:sectPr>
       <w:pgSz w:w="12240" w:h="15840"/>
@@ -2561,6 +2932,29 @@
       <w:spacing w:val="5"/>
     </w:rPr>
   </w:style>
+  <w:style w:type="character" w:styleId="Hipervnculo">
+    <w:name w:val="Hyperlink"/>
+    <w:basedOn w:val="Fuentedeprrafopredeter"/>
+    <w:uiPriority w:val="99"/>
+    <w:unhideWhenUsed/>
+    <w:rsid w:val="007A7935"/>
+    <w:rPr>
+      <w:color w:val="0563C1" w:themeColor="hyperlink"/>
+      <w:u w:val="single"/>
+    </w:rPr>
+  </w:style>
+  <w:style w:type="character" w:styleId="Mencinsinresolver">
+    <w:name w:val="Unresolved Mention"/>
+    <w:basedOn w:val="Fuentedeprrafopredeter"/>
+    <w:uiPriority w:val="99"/>
+    <w:semiHidden/>
+    <w:unhideWhenUsed/>
+    <w:rsid w:val="007A7935"/>
+    <w:rPr>
+      <w:color w:val="605E5C"/>
+      <w:shd w:val="clear" w:color="auto" w:fill="E1DFDD"/>
+    </w:rPr>
+  </w:style>
 </w:styles>
 </file>
 

</xml_diff>